<commit_message>
Update current files in hw1 and tutorial1 folders
</commit_message>
<xml_diff>
--- a/web-homeworks/web-hw1/WEB-HW1.docx
+++ b/web-homeworks/web-hw1/WEB-HW1.docx
@@ -2297,163 +2297,203 @@
         <w:bidi/>
         <w:spacing w:after="240" w:line="480" w:lineRule="auto"/>
         <w:rPr>
-          <w:sz w:val="24"/>
-          <w:szCs w:val="24"/>
-        </w:rPr>
-      </w:pPr>
-      <w:r>
-        <w:rPr>
-          <w:sz w:val="24"/>
-          <w:szCs w:val="24"/>
-          <w:rtl/>
-          <w:lang w:bidi="he-IL"/>
-        </w:rPr>
-        <w:t>ב</w:t>
-      </w:r>
-      <w:r>
-        <w:rPr>
-          <w:sz w:val="24"/>
-          <w:szCs w:val="24"/>
-          <w:rtl/>
-        </w:rPr>
-        <w:t xml:space="preserve">. </w:t>
-      </w:r>
-      <w:r>
-        <w:rPr>
-          <w:sz w:val="24"/>
-          <w:szCs w:val="24"/>
-          <w:rtl/>
-          <w:lang w:bidi="he-IL"/>
-        </w:rPr>
-        <w:t>בצעו</w:t>
-      </w:r>
-      <w:r>
-        <w:rPr>
-          <w:sz w:val="24"/>
-          <w:szCs w:val="24"/>
-          <w:rtl/>
-        </w:rPr>
-        <w:t xml:space="preserve"> </w:t>
-      </w:r>
-      <w:r>
-        <w:rPr>
-          <w:sz w:val="24"/>
-          <w:szCs w:val="24"/>
-          <w:rtl/>
-          <w:lang w:bidi="he-IL"/>
-        </w:rPr>
-        <w:t>ראיון</w:t>
-      </w:r>
-      <w:r>
-        <w:rPr>
-          <w:sz w:val="24"/>
-          <w:szCs w:val="24"/>
-          <w:rtl/>
-        </w:rPr>
-        <w:t xml:space="preserve"> </w:t>
-      </w:r>
-      <w:r>
-        <w:rPr>
-          <w:sz w:val="24"/>
-          <w:szCs w:val="24"/>
-          <w:rtl/>
-          <w:lang w:bidi="he-IL"/>
-        </w:rPr>
-        <w:t>קצר</w:t>
-      </w:r>
-      <w:r>
-        <w:rPr>
-          <w:sz w:val="24"/>
-          <w:szCs w:val="24"/>
-          <w:rtl/>
-        </w:rPr>
-        <w:t xml:space="preserve"> </w:t>
-      </w:r>
-      <w:r>
-        <w:rPr>
-          <w:sz w:val="24"/>
-          <w:szCs w:val="24"/>
-          <w:rtl/>
-          <w:lang w:bidi="he-IL"/>
-        </w:rPr>
-        <w:t>עם</w:t>
-      </w:r>
-      <w:r>
-        <w:rPr>
-          <w:sz w:val="24"/>
-          <w:szCs w:val="24"/>
-          <w:rtl/>
-        </w:rPr>
-        <w:t xml:space="preserve"> </w:t>
-      </w:r>
-      <w:r>
-        <w:rPr>
-          <w:sz w:val="24"/>
-          <w:szCs w:val="24"/>
-          <w:rtl/>
-          <w:lang w:bidi="he-IL"/>
-        </w:rPr>
-        <w:t>דמות</w:t>
-      </w:r>
-      <w:r>
-        <w:rPr>
-          <w:sz w:val="24"/>
-          <w:szCs w:val="24"/>
-          <w:rtl/>
-        </w:rPr>
-        <w:t xml:space="preserve"> </w:t>
-      </w:r>
-      <w:r>
-        <w:rPr>
-          <w:sz w:val="24"/>
-          <w:szCs w:val="24"/>
-          <w:rtl/>
-          <w:lang w:bidi="he-IL"/>
-        </w:rPr>
-        <w:t>מרכזית</w:t>
-      </w:r>
-      <w:r>
-        <w:rPr>
-          <w:sz w:val="24"/>
-          <w:szCs w:val="24"/>
-          <w:rtl/>
-        </w:rPr>
-        <w:t xml:space="preserve"> (</w:t>
-      </w:r>
-      <w:r>
-        <w:rPr>
-          <w:sz w:val="24"/>
-          <w:szCs w:val="24"/>
-          <w:rtl/>
-          <w:lang w:bidi="he-IL"/>
-        </w:rPr>
-        <w:t>אמיתית</w:t>
-      </w:r>
-      <w:r>
-        <w:rPr>
-          <w:sz w:val="24"/>
-          <w:szCs w:val="24"/>
-          <w:rtl/>
-        </w:rPr>
-        <w:t>)</w:t>
-      </w:r>
-      <w:r>
-        <w:rPr>
-          <w:rFonts w:hint="cs"/>
-          <w:sz w:val="24"/>
-          <w:szCs w:val="24"/>
-          <w:rtl/>
-          <w:lang w:bidi="he-IL"/>
-        </w:rPr>
-        <w:t xml:space="preserve"> </w:t>
-      </w:r>
-      <w:r>
-        <w:rPr>
           <w:rFonts w:hint="cs"/>
           <w:b/>
           <w:bCs/>
-          <w:sz w:val="24"/>
-          <w:szCs w:val="24"/>
+          <w:color w:val="FF0000"/>
+          <w:sz w:val="24"/>
+          <w:szCs w:val="24"/>
+          <w:lang w:bidi="he-IL"/>
+        </w:rPr>
+      </w:pPr>
+      <w:r>
+        <w:rPr>
+          <w:b/>
+          <w:bCs/>
+          <w:sz w:val="24"/>
+          <w:szCs w:val="24"/>
+          <w:rtl/>
+          <w:lang w:bidi="he-IL"/>
+        </w:rPr>
+        <w:t>ב</w:t>
+      </w:r>
+      <w:r>
+        <w:rPr>
+          <w:b/>
+          <w:bCs/>
+          <w:sz w:val="24"/>
+          <w:szCs w:val="24"/>
+          <w:rtl/>
+        </w:rPr>
+        <w:t xml:space="preserve">. </w:t>
+      </w:r>
+      <w:r>
+        <w:rPr>
+          <w:b/>
+          <w:bCs/>
+          <w:sz w:val="24"/>
+          <w:szCs w:val="24"/>
+          <w:rtl/>
+          <w:lang w:bidi="he-IL"/>
+        </w:rPr>
+        <w:t>בצעו</w:t>
+      </w:r>
+      <w:r>
+        <w:rPr>
+          <w:b/>
+          <w:bCs/>
+          <w:sz w:val="24"/>
+          <w:szCs w:val="24"/>
+          <w:rtl/>
+        </w:rPr>
+        <w:t xml:space="preserve"> </w:t>
+      </w:r>
+      <w:r>
+        <w:rPr>
+          <w:b/>
+          <w:bCs/>
+          <w:sz w:val="24"/>
+          <w:szCs w:val="24"/>
+          <w:rtl/>
+          <w:lang w:bidi="he-IL"/>
+        </w:rPr>
+        <w:t>ראיון</w:t>
+      </w:r>
+      <w:r>
+        <w:rPr>
+          <w:b/>
+          <w:bCs/>
+          <w:sz w:val="24"/>
+          <w:szCs w:val="24"/>
+          <w:rtl/>
+        </w:rPr>
+        <w:t xml:space="preserve"> </w:t>
+      </w:r>
+      <w:r>
+        <w:rPr>
+          <w:b/>
+          <w:bCs/>
+          <w:sz w:val="24"/>
+          <w:szCs w:val="24"/>
+          <w:rtl/>
+          <w:lang w:bidi="he-IL"/>
+        </w:rPr>
+        <w:t>קצר</w:t>
+      </w:r>
+      <w:r>
+        <w:rPr>
+          <w:b/>
+          <w:bCs/>
+          <w:sz w:val="24"/>
+          <w:szCs w:val="24"/>
+          <w:rtl/>
+        </w:rPr>
+        <w:t xml:space="preserve"> </w:t>
+      </w:r>
+      <w:r>
+        <w:rPr>
+          <w:b/>
+          <w:bCs/>
+          <w:sz w:val="24"/>
+          <w:szCs w:val="24"/>
+          <w:rtl/>
+          <w:lang w:bidi="he-IL"/>
+        </w:rPr>
+        <w:t>עם</w:t>
+      </w:r>
+      <w:r>
+        <w:rPr>
+          <w:b/>
+          <w:bCs/>
+          <w:sz w:val="24"/>
+          <w:szCs w:val="24"/>
+          <w:rtl/>
+        </w:rPr>
+        <w:t xml:space="preserve"> </w:t>
+      </w:r>
+      <w:r>
+        <w:rPr>
+          <w:b/>
+          <w:bCs/>
+          <w:sz w:val="24"/>
+          <w:szCs w:val="24"/>
+          <w:rtl/>
+          <w:lang w:bidi="he-IL"/>
+        </w:rPr>
+        <w:t>דמות</w:t>
+      </w:r>
+      <w:r>
+        <w:rPr>
+          <w:b/>
+          <w:bCs/>
+          <w:sz w:val="24"/>
+          <w:szCs w:val="24"/>
+          <w:rtl/>
+        </w:rPr>
+        <w:t xml:space="preserve"> </w:t>
+      </w:r>
+      <w:r>
+        <w:rPr>
+          <w:b/>
+          <w:bCs/>
+          <w:sz w:val="24"/>
+          <w:szCs w:val="24"/>
+          <w:rtl/>
+          <w:lang w:bidi="he-IL"/>
+        </w:rPr>
+        <w:t>מרכזית</w:t>
+      </w:r>
+      <w:r>
+        <w:rPr>
+          <w:b/>
+          <w:bCs/>
+          <w:sz w:val="24"/>
+          <w:szCs w:val="24"/>
+          <w:rtl/>
+        </w:rPr>
+        <w:t xml:space="preserve"> (</w:t>
+      </w:r>
+      <w:r>
+        <w:rPr>
+          <w:b/>
+          <w:bCs/>
+          <w:sz w:val="24"/>
+          <w:szCs w:val="24"/>
+          <w:rtl/>
+          <w:lang w:bidi="he-IL"/>
+        </w:rPr>
+        <w:t>אמיתית</w:t>
+      </w:r>
+      <w:r>
+        <w:rPr>
+          <w:b/>
+          <w:bCs/>
+          <w:sz w:val="24"/>
+          <w:szCs w:val="24"/>
+          <w:rtl/>
+        </w:rPr>
+        <w:t>)</w:t>
+      </w:r>
+      <w:r>
+        <w:rPr>
+          <w:rFonts w:hint="cs"/>
+          <w:b/>
+          <w:bCs/>
+          <w:sz w:val="24"/>
+          <w:szCs w:val="24"/>
+          <w:rtl/>
+          <w:lang w:bidi="he-IL"/>
+        </w:rPr>
+        <w:t xml:space="preserve"> </w:t>
+      </w:r>
+      <w:r>
+        <w:rPr>
+          <w:rFonts w:hint="cs"/>
+          <w:b/>
+          <w:bCs/>
+          <w:sz w:val="24"/>
+          <w:szCs w:val="24"/>
+          <w:highlight w:val="yellow"/>
           <w:rtl/>
           <w:lang w:bidi="he-IL"/>
         </w:rPr>
@@ -2461,14 +2501,18 @@
       </w:r>
       <w:r>
         <w:rPr>
-          <w:sz w:val="24"/>
-          <w:szCs w:val="24"/>
-          <w:rtl/>
-        </w:rPr>
-        <w:t xml:space="preserve"> </w:t>
-      </w:r>
-      <w:r>
-        <w:rPr>
+          <w:b/>
+          <w:bCs/>
+          <w:sz w:val="24"/>
+          <w:szCs w:val="24"/>
+          <w:rtl/>
+        </w:rPr>
+        <w:t xml:space="preserve"> </w:t>
+      </w:r>
+      <w:r>
+        <w:rPr>
+          <w:b/>
+          <w:bCs/>
           <w:sz w:val="24"/>
           <w:szCs w:val="24"/>
           <w:rtl/>
@@ -2478,14 +2522,18 @@
       </w:r>
       <w:r>
         <w:rPr>
-          <w:sz w:val="24"/>
-          <w:szCs w:val="24"/>
-          <w:rtl/>
-        </w:rPr>
-        <w:t xml:space="preserve"> </w:t>
-      </w:r>
-      <w:r>
-        <w:rPr>
+          <w:b/>
+          <w:bCs/>
+          <w:sz w:val="24"/>
+          <w:szCs w:val="24"/>
+          <w:rtl/>
+        </w:rPr>
+        <w:t xml:space="preserve"> </w:t>
+      </w:r>
+      <w:r>
+        <w:rPr>
+          <w:b/>
+          <w:bCs/>
           <w:sz w:val="24"/>
           <w:szCs w:val="24"/>
           <w:rtl/>
@@ -2495,14 +2543,18 @@
       </w:r>
       <w:r>
         <w:rPr>
-          <w:sz w:val="24"/>
-          <w:szCs w:val="24"/>
-          <w:rtl/>
-        </w:rPr>
-        <w:t xml:space="preserve"> </w:t>
-      </w:r>
-      <w:r>
-        <w:rPr>
+          <w:b/>
+          <w:bCs/>
+          <w:sz w:val="24"/>
+          <w:szCs w:val="24"/>
+          <w:rtl/>
+        </w:rPr>
+        <w:t xml:space="preserve"> </w:t>
+      </w:r>
+      <w:r>
+        <w:rPr>
+          <w:b/>
+          <w:bCs/>
           <w:sz w:val="24"/>
           <w:szCs w:val="24"/>
           <w:rtl/>
@@ -2512,6 +2564,8 @@
       </w:r>
       <w:r>
         <w:rPr>
+          <w:b/>
+          <w:bCs/>
           <w:sz w:val="24"/>
           <w:szCs w:val="24"/>
           <w:rtl/>
@@ -2520,6 +2574,8 @@
       </w:r>
       <w:r>
         <w:rPr>
+          <w:b/>
+          <w:bCs/>
           <w:sz w:val="24"/>
           <w:szCs w:val="24"/>
           <w:rtl/>
@@ -2529,14 +2585,18 @@
       </w:r>
       <w:r>
         <w:rPr>
-          <w:sz w:val="24"/>
-          <w:szCs w:val="24"/>
-          <w:rtl/>
-        </w:rPr>
-        <w:t xml:space="preserve"> </w:t>
-      </w:r>
-      <w:r>
-        <w:rPr>
+          <w:b/>
+          <w:bCs/>
+          <w:sz w:val="24"/>
+          <w:szCs w:val="24"/>
+          <w:rtl/>
+        </w:rPr>
+        <w:t xml:space="preserve"> </w:t>
+      </w:r>
+      <w:r>
+        <w:rPr>
+          <w:b/>
+          <w:bCs/>
           <w:sz w:val="24"/>
           <w:szCs w:val="24"/>
           <w:rtl/>
@@ -2546,14 +2606,18 @@
       </w:r>
       <w:r>
         <w:rPr>
-          <w:sz w:val="24"/>
-          <w:szCs w:val="24"/>
-          <w:rtl/>
-        </w:rPr>
-        <w:t xml:space="preserve"> </w:t>
-      </w:r>
-      <w:r>
-        <w:rPr>
+          <w:b/>
+          <w:bCs/>
+          <w:sz w:val="24"/>
+          <w:szCs w:val="24"/>
+          <w:rtl/>
+        </w:rPr>
+        <w:t xml:space="preserve"> </w:t>
+      </w:r>
+      <w:r>
+        <w:rPr>
+          <w:b/>
+          <w:bCs/>
           <w:sz w:val="24"/>
           <w:szCs w:val="24"/>
           <w:rtl/>
@@ -2563,6 +2627,8 @@
       </w:r>
       <w:r>
         <w:rPr>
+          <w:b/>
+          <w:bCs/>
           <w:sz w:val="24"/>
           <w:szCs w:val="24"/>
           <w:rtl/>
@@ -2571,6 +2637,8 @@
       </w:r>
       <w:r>
         <w:rPr>
+          <w:b/>
+          <w:bCs/>
           <w:sz w:val="24"/>
           <w:szCs w:val="24"/>
           <w:rtl/>
@@ -2580,14 +2648,18 @@
       </w:r>
       <w:r>
         <w:rPr>
-          <w:sz w:val="24"/>
-          <w:szCs w:val="24"/>
-          <w:rtl/>
-        </w:rPr>
-        <w:t xml:space="preserve"> </w:t>
-      </w:r>
-      <w:r>
-        <w:rPr>
+          <w:b/>
+          <w:bCs/>
+          <w:sz w:val="24"/>
+          <w:szCs w:val="24"/>
+          <w:rtl/>
+        </w:rPr>
+        <w:t xml:space="preserve"> </w:t>
+      </w:r>
+      <w:r>
+        <w:rPr>
+          <w:b/>
+          <w:bCs/>
           <w:sz w:val="24"/>
           <w:szCs w:val="24"/>
         </w:rPr>
@@ -2595,11 +2667,39 @@
       </w:r>
       <w:r>
         <w:rPr>
+          <w:b/>
+          <w:bCs/>
           <w:sz w:val="24"/>
           <w:szCs w:val="24"/>
           <w:rtl/>
         </w:rPr>
         <w:t>.</w:t>
+      </w:r>
+      <w:r>
+        <w:rPr>
+          <w:rFonts w:hint="cs"/>
+          <w:b/>
+          <w:bCs/>
+          <w:sz w:val="24"/>
+          <w:szCs w:val="24"/>
+          <w:rtl/>
+          <w:lang w:bidi="he-IL"/>
+        </w:rPr>
+        <w:t xml:space="preserve"> </w:t>
+      </w:r>
+      <w:r>
+        <w:rPr>
+          <w:rFonts w:hint="cs"/>
+          <w:b/>
+          <w:bCs/>
+          <w:color w:val="FF0000"/>
+          <w:sz w:val="24"/>
+          <w:szCs w:val="24"/>
+          <w:highlight w:val="yellow"/>
+          <w:rtl/>
+          <w:lang w:bidi="he-IL"/>
+        </w:rPr>
+        <w:t>יש לקבוע פגישה עם רים</w:t>
       </w:r>
     </w:p>
     <w:p>

</xml_diff>